<commit_message>
docs(submission): 按提交分支 HEAD 实测修正代码规模口径（Python 63/7446、C 20/17789、Web 2/1229）
Signed-off-by: Miles-hfy <2760216167@qq.com>
</commit_message>
<xml_diff>
--- a/docs/submission/HomeMind_技术报告_2026-09-19.docx
+++ b/docs/submission/HomeMind_技术报告_2026-09-19.docx
@@ -8785,6 +8785,7 @@
       <w:r>
         <w:rPr>
           <w:rFonts w:ascii="宋体" w:hAnsi="宋体" w:eastAsia="宋体" w:cs="宋体"/>
+          <w:sz w:val="21"/>
         </w:rPr>
         <w:t xml:space="preserve"> IDF bootloader</w:t>
       </w:r>
@@ -8799,6 +8800,7 @@
       <w:r>
         <w:rPr>
           <w:rFonts w:ascii="宋体" w:hAnsi="宋体" w:eastAsia="宋体" w:cs="宋体"/>
+          <w:sz w:val="21"/>
         </w:rPr>
         <w:t xml:space="preserve"> </w:t>
       </w:r>
@@ -8811,7 +8813,8 @@
       </w:r>
       <w:r>
         <w:rPr>
-          <w:rFonts w:ascii="宋体" w:eastAsia="宋体" w:hAnsi="宋体" w:cs="宋体" w:hint="eastAsia"/>
+          <w:rFonts w:ascii="宋体" w:hAnsi="宋体" w:eastAsia="宋体" w:cs="宋体" w:hint="eastAsia"/>
+          <w:sz w:val="21"/>
           <w:lang w:eastAsia="zh-CN"/>
         </w:rPr>
         <w:t>。建议在</w:t>
@@ -8825,7 +8828,8 @@
       </w:r>
       <w:r>
         <w:rPr>
-          <w:rFonts w:ascii="宋体" w:eastAsia="宋体" w:hAnsi="宋体" w:cs="宋体" w:hint="eastAsia"/>
+          <w:rFonts w:ascii="宋体" w:hAnsi="宋体" w:eastAsia="宋体" w:cs="宋体" w:hint="eastAsia"/>
+          <w:sz w:val="21"/>
           <w:lang w:eastAsia="zh-CN"/>
         </w:rPr>
         <w:t>的</w:t>
@@ -8839,7 +8843,8 @@
       </w:r>
       <w:r>
         <w:rPr>
-          <w:rFonts w:ascii="宋体" w:eastAsia="宋体" w:hAnsi="宋体" w:cs="宋体" w:hint="eastAsia"/>
+          <w:rFonts w:ascii="宋体" w:hAnsi="宋体" w:eastAsia="宋体" w:cs="宋体" w:hint="eastAsia"/>
+          <w:sz w:val="21"/>
           <w:lang w:eastAsia="zh-CN"/>
         </w:rPr>
         <w:t>移植文档中显式说明该布局，避免误写</w:t>
@@ -9064,14 +9069,29 @@
           <w:sz w:val="21"/>
           <w:lang w:eastAsia="zh-CN"/>
         </w:rPr>
-        <w:t>仓库代码规模：</w:t>
+        <w:t>仓库代码规模（按提交分支</w:t>
       </w:r>
       <w:r>
         <w:rPr>
           <w:rFonts w:ascii="宋体" w:hAnsi="宋体" w:eastAsia="宋体" w:cs="宋体"/>
           <w:sz w:val="21"/>
         </w:rPr>
-        <w:t xml:space="preserve">Python 64 </w:t>
+        <w:t xml:space="preserve"> HEAD </w:t>
+      </w:r>
+      <w:r>
+        <w:rPr>
+          <w:rFonts w:ascii="宋体" w:hAnsi="宋体" w:eastAsia="宋体" w:cs="宋体" w:hint="eastAsia"/>
+          <w:sz w:val="21"/>
+          <w:lang w:eastAsia="zh-CN"/>
+        </w:rPr>
+        <w:t>实测）：</w:t>
+      </w:r>
+      <w:r>
+        <w:rPr>
+          <w:rFonts w:ascii="宋体" w:hAnsi="宋体" w:eastAsia="宋体" w:cs="宋体"/>
+          <w:sz w:val="21"/>
+        </w:rPr>
+        <w:t xml:space="preserve">Python 63 </w:t>
       </w:r>
       <w:r>
         <w:rPr>
@@ -9086,7 +9106,7 @@
           <w:rFonts w:ascii="宋体" w:hAnsi="宋体" w:eastAsia="宋体" w:cs="宋体"/>
           <w:sz w:val="21"/>
         </w:rPr>
-        <w:t xml:space="preserve"> / 8 039 </w:t>
+        <w:t xml:space="preserve"> / 7 446 </w:t>
       </w:r>
       <w:r>
         <w:rPr>
@@ -9116,7 +9136,7 @@
           <w:rFonts w:ascii="宋体" w:hAnsi="宋体" w:eastAsia="宋体" w:cs="宋体"/>
           <w:sz w:val="21"/>
         </w:rPr>
-        <w:t xml:space="preserve"> / 18 268 </w:t>
+        <w:t xml:space="preserve"> / 17 789 </w:t>
       </w:r>
       <w:r>
         <w:rPr>
@@ -9154,44 +9174,44 @@
           <w:sz w:val="21"/>
           <w:lang w:eastAsia="zh-CN"/>
         </w:rPr>
-        <w:t>个文件（</w:t>
+        <w:t>个文件</w:t>
+      </w:r>
+      <w:r>
+        <w:rPr>
+          <w:rFonts w:ascii="宋体" w:hAnsi="宋体" w:eastAsia="宋体" w:cs="宋体"/>
+          <w:sz w:val="21"/>
+        </w:rPr>
+        <w:t xml:space="preserve"> / 1 229 </w:t>
+      </w:r>
+      <w:r>
+        <w:rPr>
+          <w:rFonts w:ascii="宋体" w:hAnsi="宋体" w:eastAsia="宋体" w:cs="宋体" w:hint="eastAsia"/>
+          <w:sz w:val="21"/>
+          <w:lang w:eastAsia="zh-CN"/>
+        </w:rPr>
+        <w:t>行（</w:t>
       </w:r>
       <w:r>
         <w:rPr>
           <w:rFonts w:ascii="宋体" w:hAnsi="宋体" w:eastAsia="宋体" w:cs="宋体"/>
           <w:sz w:val="19"/>
         </w:rPr>
-        <w:t>web/landing/index.html</w:t>
-      </w:r>
-      <w:r>
-        <w:rPr>
-          <w:rFonts w:ascii="宋体" w:hAnsi="宋体" w:eastAsia="宋体" w:cs="宋体" w:hint="eastAsia"/>
-          <w:sz w:val="21"/>
-          <w:lang w:eastAsia="zh-CN"/>
-        </w:rPr>
-        <w:t>、</w:t>
+        <w:t>web/landing/</w:t>
+      </w:r>
+      <w:r>
+        <w:rPr>
+          <w:rFonts w:ascii="宋体" w:hAnsi="宋体" w:eastAsia="宋体" w:cs="宋体" w:hint="eastAsia"/>
+          <w:sz w:val="21"/>
+          <w:lang w:eastAsia="zh-CN"/>
+        </w:rPr>
+        <w:t>）；</w:t>
       </w:r>
       <w:r>
         <w:rPr>
           <w:rFonts w:ascii="宋体" w:hAnsi="宋体" w:eastAsia="宋体" w:cs="宋体"/>
-          <w:sz w:val="19"/>
-        </w:rPr>
-        <w:t>web/landing/hm-app.js</w:t>
-      </w:r>
-      <w:r>
-        <w:rPr>
-          <w:rFonts w:ascii="宋体" w:hAnsi="宋体" w:eastAsia="宋体" w:cs="宋体" w:hint="eastAsia"/>
-          <w:sz w:val="21"/>
-          <w:lang w:eastAsia="zh-CN"/>
-        </w:rPr>
-        <w:t>）；</w:t>
-      </w:r>
-      <w:r>
-        <w:rPr>
-          <w:rFonts w:ascii="宋体" w:hAnsi="宋体" w:eastAsia="宋体" w:cs="宋体"/>
-          <w:sz w:val="21"/>
-        </w:rPr>
-        <w:t xml:space="preserve">Markdown 108 </w:t>
+          <w:sz w:val="21"/>
+        </w:rPr>
+        <w:t xml:space="preserve">Markdown 114 </w:t>
       </w:r>
       <w:r>
         <w:rPr>
@@ -21175,14 +21195,102 @@
           <w:sz w:val="21"/>
           <w:lang w:eastAsia="zh-CN"/>
         </w:rPr>
-        <w:t>改写并已合入的源码行数为分子，全仓源码行数为分母。全仓</w:t>
+        <w:t>改写并已合入的源码行数为分子，全仓源码行数为分母。统计口径为</w:t>
+      </w:r>
+      <w:r>
+        <w:rPr>
+          <w:rFonts w:ascii="宋体" w:hAnsi="宋体" w:eastAsia="宋体" w:cs="宋体" w:hint="eastAsia"/>
+          <w:b/>
+          <w:sz w:val="21"/>
+          <w:lang w:eastAsia="zh-CN"/>
+        </w:rPr>
+        <w:t xml:space="preserve">提交分支 HEAD 中全部 </w:t>
       </w:r>
       <w:r>
         <w:rPr>
           <w:rFonts w:ascii="宋体" w:hAnsi="宋体" w:eastAsia="宋体" w:cs="宋体"/>
-          <w:sz w:val="21"/>
-        </w:rPr>
-        <w:t xml:space="preserve"> Python 8 039 </w:t>
+          <w:b/>
+          <w:sz w:val="19"/>
+        </w:rPr>
+        <w:t>*.py</w:t>
+      </w:r>
+      <w:r>
+        <w:rPr>
+          <w:rFonts w:ascii="宋体" w:hAnsi="宋体" w:eastAsia="宋体" w:cs="宋体" w:hint="eastAsia"/>
+          <w:b/>
+          <w:sz w:val="21"/>
+          <w:lang w:eastAsia="zh-CN"/>
+        </w:rPr>
+        <w:t xml:space="preserve"> 与 </w:t>
+      </w:r>
+      <w:r>
+        <w:rPr>
+          <w:rFonts w:ascii="宋体" w:hAnsi="宋体" w:eastAsia="宋体" w:cs="宋体"/>
+          <w:b/>
+          <w:sz w:val="19"/>
+        </w:rPr>
+        <w:t>*.c</w:t>
+      </w:r>
+      <w:r>
+        <w:rPr>
+          <w:rFonts w:ascii="宋体" w:hAnsi="宋体" w:eastAsia="宋体" w:cs="宋体" w:hint="eastAsia"/>
+          <w:b/>
+          <w:sz w:val="21"/>
+          <w:lang w:eastAsia="zh-CN"/>
+        </w:rPr>
+        <w:t xml:space="preserve"> 文件的行数</w:t>
+      </w:r>
+      <w:r>
+        <w:rPr>
+          <w:rFonts w:ascii="宋体" w:hAnsi="宋体" w:eastAsia="宋体" w:cs="宋体" w:hint="eastAsia"/>
+          <w:sz w:val="21"/>
+          <w:lang w:eastAsia="zh-CN"/>
+        </w:rPr>
+        <w:t xml:space="preserve">（不含 </w:t>
+      </w:r>
+      <w:r>
+        <w:rPr>
+          <w:rFonts w:ascii="宋体" w:hAnsi="宋体" w:eastAsia="宋体" w:cs="宋体"/>
+          <w:sz w:val="19"/>
+        </w:rPr>
+        <w:t>.git</w:t>
+      </w:r>
+      <w:r>
+        <w:rPr>
+          <w:rFonts w:ascii="宋体" w:hAnsi="宋体" w:eastAsia="宋体" w:cs="宋体"/>
+          <w:sz w:val="21"/>
+        </w:rPr>
+        <w:t xml:space="preserve"> </w:t>
+      </w:r>
+      <w:r>
+        <w:rPr>
+          <w:rFonts w:ascii="宋体" w:hAnsi="宋体" w:eastAsia="宋体" w:cs="宋体" w:hint="eastAsia"/>
+          <w:sz w:val="21"/>
+          <w:lang w:eastAsia="zh-CN"/>
+        </w:rPr>
+        <w:t>与虚拟环境）：</w:t>
+      </w:r>
+      <w:r>
+        <w:rPr>
+          <w:rFonts w:ascii="宋体" w:hAnsi="宋体" w:eastAsia="宋体" w:cs="宋体"/>
+          <w:sz w:val="21"/>
+        </w:rPr>
+        <w:t xml:space="preserve">Python 63 </w:t>
+      </w:r>
+      <w:r>
+        <w:rPr>
+          <w:rFonts w:ascii="宋体" w:hAnsi="宋体" w:eastAsia="宋体" w:cs="宋体" w:hint="eastAsia"/>
+          <w:sz w:val="21"/>
+          <w:lang w:eastAsia="zh-CN"/>
+        </w:rPr>
+        <w:t>个文件</w:t>
+      </w:r>
+      <w:r>
+        <w:rPr>
+          <w:rFonts w:ascii="宋体" w:hAnsi="宋体" w:eastAsia="宋体" w:cs="宋体"/>
+          <w:sz w:val="21"/>
+        </w:rPr>
+        <w:t xml:space="preserve"> 7 446 </w:t>
       </w:r>
       <w:r>
         <w:rPr>
@@ -21197,7 +21305,37 @@
           <w:rFonts w:ascii="宋体" w:hAnsi="宋体" w:eastAsia="宋体" w:cs="宋体"/>
           <w:sz w:val="21"/>
         </w:rPr>
-        <w:t xml:space="preserve"> + C 18 268 </w:t>
+        <w:t xml:space="preserve"> </w:t>
+      </w:r>
+      <w:r>
+        <w:rPr>
+          <w:rFonts w:ascii="宋体" w:hAnsi="宋体" w:eastAsia="宋体" w:cs="宋体" w:hint="eastAsia"/>
+          <w:sz w:val="21"/>
+          <w:lang w:eastAsia="zh-CN"/>
+        </w:rPr>
+        <w:t>＋</w:t>
+      </w:r>
+      <w:r>
+        <w:rPr>
+          <w:rFonts w:ascii="宋体" w:hAnsi="宋体" w:eastAsia="宋体" w:cs="宋体"/>
+          <w:sz w:val="21"/>
+        </w:rPr>
+        <w:t xml:space="preserve"> C 20 </w:t>
+      </w:r>
+      <w:r>
+        <w:rPr>
+          <w:rFonts w:ascii="宋体" w:hAnsi="宋体" w:eastAsia="宋体" w:cs="宋体" w:hint="eastAsia"/>
+          <w:sz w:val="21"/>
+          <w:lang w:eastAsia="zh-CN"/>
+        </w:rPr>
+        <w:t>个文件</w:t>
+      </w:r>
+      <w:r>
+        <w:rPr>
+          <w:rFonts w:ascii="宋体" w:hAnsi="宋体" w:eastAsia="宋体" w:cs="宋体"/>
+          <w:sz w:val="21"/>
+        </w:rPr>
+        <w:t xml:space="preserve"> 17 789 </w:t>
       </w:r>
       <w:r>
         <w:rPr>
@@ -21212,7 +21350,22 @@
           <w:rFonts w:ascii="宋体" w:hAnsi="宋体" w:eastAsia="宋体" w:cs="宋体"/>
           <w:sz w:val="21"/>
         </w:rPr>
-        <w:t xml:space="preserve"> = 26 307 </w:t>
+        <w:t xml:space="preserve"> </w:t>
+      </w:r>
+      <w:r>
+        <w:rPr>
+          <w:rFonts w:ascii="宋体" w:hAnsi="宋体" w:eastAsia="宋体" w:cs="宋体" w:hint="eastAsia"/>
+          <w:sz w:val="21"/>
+          <w:lang w:eastAsia="zh-CN"/>
+        </w:rPr>
+        <w:t>＝</w:t>
+      </w:r>
+      <w:r>
+        <w:rPr>
+          <w:rFonts w:ascii="宋体" w:hAnsi="宋体" w:eastAsia="宋体" w:cs="宋体"/>
+          <w:sz w:val="21"/>
+        </w:rPr>
+        <w:t xml:space="preserve"> 25 235 </w:t>
       </w:r>
       <w:r>
         <w:rPr>

</xml_diff>